<commit_message>
AA-6 frase introduttiva della residenza come paragrafo (scostamento motivato); interventi su TTFB, link e head ora guidati da questo progetto
Co-Authored-By: Claude Opus 5.5 <noreply@anthropic.com>
Claude-Session: https://claude.ai/code/session_01Rr1X44gsg7BUwMzrRvYrc2
</commit_message>
<xml_diff>
--- a/docs/docx/aa-1-6.docx
+++ b/docs/docx/aa-1-6.docx
@@ -1038,7 +1038,28 @@
         <w:pStyle w:val="Compact"/>
       </w:pPr>
       <w:r>
-        <w:t xml:space="preserve">Scheda residenza: H3 introduttivo → H2; voci dell'accordion H2 → H3; blocco contatti («Vuoi essere ricontattato?»,</w:t>
+        <w:t xml:space="preserve">Scheda residenza: frase introduttiva sotto l'H1 da H3 a</w:t>
+      </w:r>
+      <w:r>
+        <w:t xml:space="preserve"> </w:t>
+      </w:r>
+      <w:r>
+        <w:rPr>
+          <w:rStyle w:val="VerbatimChar"/>
+        </w:rPr>
+        <w:t xml:space="preserve">&lt;p&gt;</w:t>
+      </w:r>
+      <w:r>
+        <w:t xml:space="preserve"> </w:t>
+      </w:r>
+      <w:r>
+        <w:t xml:space="preserve">con la stessa resa grafica; voci dell'accordion H2</w:t>
+      </w:r>
+      <w:r>
+        <w:t xml:space="preserve"> </w:t>
+      </w:r>
+      <w:r>
+        <w:t xml:space="preserve">(sezioni della pagina), senza il testo del pulsante; blocco contatti («Vuoi essere ricontattato?»,</w:t>
       </w:r>
       <w:r>
         <w:t xml:space="preserve"> </w:t>
@@ -1059,7 +1080,13 @@
         <w:t xml:space="preserve"> </w:t>
       </w:r>
       <w:r>
-        <w:t xml:space="preserve">con la stessa classe grafica.</w:t>
+        <w:t xml:space="preserve">con la stessa classe grafica. Risultato: H1 nome della residenza › H2 sezioni</w:t>
+      </w:r>
+      <w:r>
+        <w:t xml:space="preserve"> </w:t>
+      </w:r>
+      <w:r>
+        <w:t xml:space="preserve">(ospiti, servizi sanitari, socializzazione, comfort, tariffe, documenti) › H3 sottosezioni.</w:t>
       </w:r>
     </w:p>
     <w:p>
@@ -1124,28 +1151,47 @@
         <w:pStyle w:val="FirstParagraph"/>
       </w:pPr>
       <w:r>
-        <w:t xml:space="preserve">Da decidere: l'audit chiede di trasformare in H2 la frase introduttiva sotto l'H1. È una frase, non un</w:t>
-      </w:r>
-      <w:r>
-        <w:t xml:space="preserve"> </w:t>
-      </w:r>
-      <w:r>
-        <w:t xml:space="preserve">titolo: in alternativa</w:t>
-      </w:r>
-      <w:r>
-        <w:t xml:space="preserve"> </w:t>
-      </w:r>
-      <w:r>
-        <w:rPr>
-          <w:rStyle w:val="VerbatimChar"/>
-        </w:rPr>
-        <w:t xml:space="preserve">&lt;p&gt;</w:t>
-      </w:r>
-      <w:r>
-        <w:t xml:space="preserve"> </w:t>
-      </w:r>
-      <w:r>
-        <w:t xml:space="preserve">con la stessa resa, H2 riservati alle sezioni. Si segue l'audit salvo indicazione diversa.</w:t>
+        <w:rPr>
+          <w:bCs/>
+          <w:b/>
+        </w:rPr>
+        <w:t xml:space="preserve">Scostamento motivato dall'azione dell'audit (deciso il 22/10):</w:t>
+      </w:r>
+      <w:r>
+        <w:t xml:space="preserve"> </w:t>
+      </w:r>
+      <w:r>
+        <w:t xml:space="preserve">l'audit propone di trasformare in H2 la frase</w:t>
+      </w:r>
+      <w:r>
+        <w:t xml:space="preserve"> </w:t>
+      </w:r>
+      <w:r>
+        <w:t xml:space="preserve">introduttiva sotto l'H1 e di portare a H3 le voci dell'accordion. La frase introduttiva è un testo descrittivo, non il</w:t>
+      </w:r>
+      <w:r>
+        <w:t xml:space="preserve"> </w:t>
+      </w:r>
+      <w:r>
+        <w:t xml:space="preserve">titolo di una sezione: come titolo darebbe ai motori e ai sistemi AI un'intestazione lunga e generica sopra sezioni che</w:t>
+      </w:r>
+      <w:r>
+        <w:t xml:space="preserve"> </w:t>
+      </w:r>
+      <w:r>
+        <w:t xml:space="preserve">non la riguardano. Diventa quindi un paragrafo, e le voci dell'accordion restano H2 come sezioni principali della</w:t>
+      </w:r>
+      <w:r>
+        <w:t xml:space="preserve"> </w:t>
+      </w:r>
+      <w:r>
+        <w:t xml:space="preserve">pagina. L'obiettivo dell'audit (nessun H2 duplicato, gerarchia chiara) è raggiunto; la scelta va motivata nella nota di</w:t>
+      </w:r>
+      <w:r>
+        <w:t xml:space="preserve"> </w:t>
+      </w:r>
+      <w:r>
+        <w:t xml:space="preserve">consegna dello sprint 2.</w:t>
       </w:r>
     </w:p>
     <w:bookmarkEnd w:id="24"/>

</xml_diff>

<commit_message>
AA-1 AA-6 esito dell'esportazione dei contenuti: varianti del markup e piano di conversione
Co-Authored-By: Claude Opus 5.5 <noreply@anthropic.com>
Claude-Session: https://claude.ai/code/session_01Rr1X44gsg7BUwMzrRvYrc2
</commit_message>
<xml_diff>
--- a/docs/docx/aa-1-6.docx
+++ b/docs/docx/aa-1-6.docx
@@ -2,7 +2,7 @@
 <file path=word/document.xml><?xml version="1.0" encoding="utf-8"?>
 <w:document xmlns:w="http://schemas.openxmlformats.org/wordprocessingml/2006/main" xmlns:m="http://schemas.openxmlformats.org/officeDocument/2006/math" xmlns:r="http://schemas.openxmlformats.org/officeDocument/2006/relationships" xmlns:o="urn:schemas-microsoft-com:office:office" xmlns:v="urn:schemas-microsoft-com:vml" xmlns:w10="urn:schemas-microsoft-com:office:word" xmlns:a="http://schemas.openxmlformats.org/drawingml/2006/main" xmlns:pic="http://schemas.openxmlformats.org/drawingml/2006/picture" xmlns:wp="http://schemas.openxmlformats.org/drawingml/2006/wordprocessingDrawing">
   <w:body>
-    <w:bookmarkStart w:id="27" w:name="X8e9ac67b548febbf1d60acffc619be74f25e7ad"/>
+    <w:bookmarkStart w:id="28" w:name="X8e9ac67b548febbf1d60acffc619be74f25e7ad"/>
     <w:p>
       <w:pPr>
         <w:pStyle w:val="Heading1"/>
@@ -1196,13 +1196,36 @@
     </w:p>
     <w:bookmarkEnd w:id="24"/>
     <w:bookmarkEnd w:id="25"/>
-    <w:bookmarkStart w:id="26" w:name="prossimi-passi"/>
+    <w:bookmarkStart w:id="26" w:name="Xf7188464b7884226153f734cb8da6c74012eb26"/>
     <w:p>
       <w:pPr>
         <w:pStyle w:val="Heading2"/>
       </w:pPr>
       <w:r>
-        <w:t xml:space="preserve">Prossimi passi</w:t>
+        <w:t xml:space="preserve">Esito dell'esportazione dei contenuti (22/10)</w:t>
+      </w:r>
+    </w:p>
+    <w:p>
+      <w:pPr>
+        <w:pStyle w:val="FirstParagraph"/>
+      </w:pPr>
+      <w:r>
+        <w:t xml:space="preserve">Contenuti di 62 schede residenza, 5 centri diurni, 10 regioni e 14 province (</w:t>
+      </w:r>
+      <w:r>
+        <w:rPr>
+          <w:rStyle w:val="VerbatimChar"/>
+        </w:rPr>
+        <w:t xml:space="preserve">scripts/checks/aa-esporta-contenuti.php</w:t>
+      </w:r>
+      <w:r>
+        <w:t xml:space="preserve">).</w:t>
+      </w:r>
+      <w:r>
+        <w:t xml:space="preserve"> </w:t>
+      </w:r>
+      <w:r>
+        <w:t xml:space="preserve">Il markup è molto regolare:</w:t>
       </w:r>
     </w:p>
     <w:p>
@@ -1214,13 +1237,65 @@
         <w:pStyle w:val="Compact"/>
       </w:pPr>
       <w:r>
-        <w:t xml:space="preserve">Estrazione in sola lettura del contenuto delle schede residenza (varianti del markup dell'accordion, intro e</w:t>
-      </w:r>
-      <w:r>
-        <w:t xml:space="preserve"> </w:t>
-      </w:r>
-      <w:r>
-        <w:t xml:space="preserve">contatti) per scrivere lo script di conversione.</w:t>
+        <w:rPr>
+          <w:bCs/>
+          <w:b/>
+        </w:rPr>
+        <w:t xml:space="preserve">Frase introduttiva</w:t>
+      </w:r>
+      <w:r>
+        <w:t xml:space="preserve">: in tutte le 62 residenze è il primo titolo,</w:t>
+      </w:r>
+      <w:r>
+        <w:t xml:space="preserve"> </w:t>
+      </w:r>
+      <w:r>
+        <w:rPr>
+          <w:rStyle w:val="VerbatimChar"/>
+        </w:rPr>
+        <w:t xml:space="preserve">&lt;h3 class="text-primary"&gt;</w:t>
+      </w:r>
+      <w:r>
+        <w:t xml:space="preserve">; nei centri diurni è già</w:t>
+      </w:r>
+      <w:r>
+        <w:t xml:space="preserve"> </w:t>
+      </w:r>
+      <w:r>
+        <w:rPr>
+          <w:rStyle w:val="VerbatimChar"/>
+        </w:rPr>
+        <w:t xml:space="preserve">&lt;h2 class="h3 ..."&gt;</w:t>
+      </w:r>
+      <w:r>
+        <w:t xml:space="preserve">. Diventa</w:t>
+      </w:r>
+      <w:r>
+        <w:t xml:space="preserve"> </w:t>
+      </w:r>
+      <w:r>
+        <w:rPr>
+          <w:rStyle w:val="VerbatimChar"/>
+        </w:rPr>
+        <w:t xml:space="preserve">&lt;p class="h3 text-primary"&gt;</w:t>
+      </w:r>
+      <w:r>
+        <w:t xml:space="preserve">: stessa resa grafica (classe</w:t>
+      </w:r>
+      <w:r>
+        <w:t xml:space="preserve"> </w:t>
+      </w:r>
+      <w:r>
+        <w:rPr>
+          <w:rStyle w:val="VerbatimChar"/>
+        </w:rPr>
+        <w:t xml:space="preserve">.h3</w:t>
+      </w:r>
+      <w:r>
+        <w:t xml:space="preserve"> </w:t>
+      </w:r>
+      <w:r>
+        <w:t xml:space="preserve">di Bootstrap).</w:t>
       </w:r>
     </w:p>
     <w:p>
@@ -1232,19 +1307,110 @@
         <w:pStyle w:val="Compact"/>
       </w:pPr>
       <w:r>
-        <w:t xml:space="preserve">Elementi da modificare in</w:t>
-      </w:r>
-      <w:r>
-        <w:t xml:space="preserve"> </w:t>
-      </w:r>
-      <w:r>
-        <w:rPr>
-          <w:rStyle w:val="VerbatimChar"/>
-        </w:rPr>
-        <w:t xml:space="preserve">docs/elementi-sotto-progetto.md</w:t>
-      </w:r>
-      <w:r>
-        <w:t xml:space="preserve">.</w:t>
+        <w:rPr>
+          <w:bCs/>
+          <w:b/>
+        </w:rPr>
+        <w:t xml:space="preserve">Accordion</w:t>
+      </w:r>
+      <w:r>
+        <w:t xml:space="preserve">: markup Bootstrap identico in tutte le pagine,</w:t>
+      </w:r>
+      <w:r>
+        <w:t xml:space="preserve"> </w:t>
+      </w:r>
+      <w:r>
+        <w:rPr>
+          <w:rStyle w:val="VerbatimChar"/>
+        </w:rPr>
+        <w:t xml:space="preserve">&lt;h2 class="accordion-header"&gt;&lt;button&gt;</w:t>
+      </w:r>
+      <w:r>
+        <w:t xml:space="preserve"> </w:t>
+      </w:r>
+      <w:r>
+        <w:t xml:space="preserve">con il titolo in</w:t>
+      </w:r>
+      <w:r>
+        <w:t xml:space="preserve"> </w:t>
+      </w:r>
+      <w:r>
+        <w:rPr>
+          <w:rStyle w:val="VerbatimChar"/>
+        </w:rPr>
+        <w:t xml:space="preserve">.accordion-button-text</w:t>
+      </w:r>
+      <w:r>
+        <w:t xml:space="preserve"> </w:t>
+      </w:r>
+      <w:r>
+        <w:t xml:space="preserve">e il testo «Guarda meno / Guarda di più» in</w:t>
+      </w:r>
+      <w:r>
+        <w:t xml:space="preserve"> </w:t>
+      </w:r>
+      <w:r>
+        <w:rPr>
+          <w:rStyle w:val="VerbatimChar"/>
+        </w:rPr>
+        <w:t xml:space="preserve">.accordion-button-helper</w:t>
+      </w:r>
+      <w:r>
+        <w:t xml:space="preserve">, dentro il pulsante e</w:t>
+      </w:r>
+      <w:r>
+        <w:t xml:space="preserve"> </w:t>
+      </w:r>
+      <w:r>
+        <w:t xml:space="preserve">quindi dentro l'H2 (5 voci in 58 residenze). Il testo del pulsante passa da contenuto HTML a contenuto generato dal</w:t>
+      </w:r>
+      <w:r>
+        <w:t xml:space="preserve"> </w:t>
+      </w:r>
+      <w:r>
+        <w:t xml:space="preserve">CSS (</w:t>
+      </w:r>
+      <w:r>
+        <w:rPr>
+          <w:rStyle w:val="VerbatimChar"/>
+        </w:rPr>
+        <w:t xml:space="preserve">content: attr(data-testo)</w:t>
+      </w:r>
+      <w:r>
+        <w:t xml:space="preserve"> </w:t>
+      </w:r>
+      <w:r>
+        <w:t xml:space="preserve">su</w:t>
+      </w:r>
+      <w:r>
+        <w:t xml:space="preserve"> </w:t>
+      </w:r>
+      <w:r>
+        <w:rPr>
+          <w:rStyle w:val="VerbatimChar"/>
+        </w:rPr>
+        <w:t xml:space="preserve">::after</w:t>
+      </w:r>
+      <w:r>
+        <w:t xml:space="preserve">,</w:t>
+      </w:r>
+      <w:r>
+        <w:t xml:space="preserve"> </w:t>
+      </w:r>
+      <w:r>
+        <w:rPr>
+          <w:rStyle w:val="VerbatimChar"/>
+        </w:rPr>
+        <w:t xml:space="preserve">aria-hidden</w:t>
+      </w:r>
+      <w:r>
+        <w:t xml:space="preserve">): resta visibile e cliccabile, esce dal testo del</w:t>
+      </w:r>
+      <w:r>
+        <w:t xml:space="preserve"> </w:t>
+      </w:r>
+      <w:r>
+        <w:t xml:space="preserve">titolo. Stessa sostituzione nei 24 chunk con lo stesso accordion (regioni, FAQ, cure).</w:t>
       </w:r>
     </w:p>
     <w:p>
@@ -1256,11 +1422,454 @@
         <w:pStyle w:val="Compact"/>
       </w:pPr>
       <w:r>
+        <w:rPr>
+          <w:bCs/>
+          <w:b/>
+        </w:rPr>
+        <w:t xml:space="preserve">Sezioni dopo l'accordion</w:t>
+      </w:r>
+      <w:r>
+        <w:t xml:space="preserve">: «Vuoi essere ricontattato?» e «Lasciaci i tuoi dati» (chunk</w:t>
+      </w:r>
+      <w:r>
+        <w:t xml:space="preserve"> </w:t>
+      </w:r>
+      <w:r>
+        <w:rPr>
+          <w:rStyle w:val="VerbatimChar"/>
+        </w:rPr>
+        <w:t xml:space="preserve">form-contatti-hs</w:t>
+      </w:r>
+      <w:r>
+        <w:t xml:space="preserve">) →</w:t>
+      </w:r>
+      <w:r>
+        <w:t xml:space="preserve"> </w:t>
+      </w:r>
+      <w:r>
+        <w:t xml:space="preserve">paragrafi; «Scopri le foto» (chunk</w:t>
+      </w:r>
+      <w:r>
+        <w:t xml:space="preserve"> </w:t>
+      </w:r>
+      <w:r>
+        <w:rPr>
+          <w:rStyle w:val="VerbatimChar"/>
+        </w:rPr>
+        <w:t xml:space="preserve">gal-*</w:t>
+      </w:r>
+      <w:r>
+        <w:t xml:space="preserve">), «Guarda il video» (chunk</w:t>
+      </w:r>
+      <w:r>
+        <w:t xml:space="preserve"> </w:t>
+      </w:r>
+      <w:r>
+        <w:rPr>
+          <w:rStyle w:val="VerbatimChar"/>
+        </w:rPr>
+        <w:t xml:space="preserve">video-*</w:t>
+      </w:r>
+      <w:r>
+        <w:t xml:space="preserve">), «Casa Anni Azzurri» (podcast),</w:t>
+      </w:r>
+      <w:r>
+        <w:t xml:space="preserve"> </w:t>
+      </w:r>
+      <w:r>
+        <w:t xml:space="preserve">«Come raggiungerci» (contenuto) oggi H3 e quindi annidati sotto «Tariffe»: diventano H2 con classe</w:t>
+      </w:r>
+      <w:r>
+        <w:t xml:space="preserve"> </w:t>
+      </w:r>
+      <w:r>
+        <w:rPr>
+          <w:rStyle w:val="VerbatimChar"/>
+        </w:rPr>
+        <w:t xml:space="preserve">h3</w:t>
+      </w:r>
+      <w:r>
+        <w:t xml:space="preserve"> </w:t>
+      </w:r>
+      <w:r>
+        <w:t xml:space="preserve">(stessa</w:t>
+      </w:r>
+      <w:r>
+        <w:t xml:space="preserve"> </w:t>
+      </w:r>
+      <w:r>
+        <w:t xml:space="preserve">resa), come «Documenti informativi» che è già H2.</w:t>
+      </w:r>
+    </w:p>
+    <w:p>
+      <w:pPr>
+        <w:numPr>
+          <w:ilvl w:val="0"/>
+          <w:numId w:val="1005"/>
+        </w:numPr>
+        <w:pStyle w:val="Compact"/>
+      </w:pPr>
+      <w:r>
+        <w:rPr>
+          <w:bCs/>
+          <w:b/>
+        </w:rPr>
+        <w:t xml:space="preserve">Newsletter</w:t>
+      </w:r>
+      <w:r>
+        <w:t xml:space="preserve"> </w:t>
+      </w:r>
+      <w:r>
+        <w:t xml:space="preserve">nel footer:</w:t>
+      </w:r>
+      <w:r>
+        <w:t xml:space="preserve"> </w:t>
+      </w:r>
+      <w:r>
+        <w:rPr>
+          <w:rStyle w:val="VerbatimChar"/>
+        </w:rPr>
+        <w:t xml:space="preserve">&lt;h2 class="h3"&gt;</w:t>
+      </w:r>
+      <w:r>
+        <w:t xml:space="preserve"> </w:t>
+      </w:r>
+      <w:r>
+        <w:t xml:space="preserve">→</w:t>
+      </w:r>
+      <w:r>
+        <w:t xml:space="preserve"> </w:t>
+      </w:r>
+      <w:r>
+        <w:rPr>
+          <w:rStyle w:val="VerbatimChar"/>
+        </w:rPr>
+        <w:t xml:space="preserve">&lt;p class="h3"&gt;</w:t>
+      </w:r>
+      <w:r>
+        <w:t xml:space="preserve">.</w:t>
+      </w:r>
+    </w:p>
+    <w:p>
+      <w:pPr>
+        <w:pStyle w:val="FirstParagraph"/>
+      </w:pPr>
+      <w:r>
+        <w:t xml:space="preserve">Struttura risultante della scheda residenza: H1 nome › H2 Gli ospiti che accogliamo, Servizi sanitari, Percorsi di</w:t>
+      </w:r>
+      <w:r>
+        <w:t xml:space="preserve"> </w:t>
+      </w:r>
+      <w:r>
+        <w:t xml:space="preserve">socializzazione e stimolazione, Comfort alberghieri, Tariffe, Scopri le foto, Guarda il video, Casa Anni Azzurri,</w:t>
+      </w:r>
+      <w:r>
+        <w:t xml:space="preserve"> </w:t>
+      </w:r>
+      <w:r>
+        <w:t xml:space="preserve">Documenti informativi, Come raggiungerci › H3 sottosezioni interne.</w:t>
+      </w:r>
+    </w:p>
+    <w:p>
+      <w:pPr>
+        <w:pStyle w:val="BodyText"/>
+      </w:pPr>
+      <w:r>
+        <w:t xml:space="preserve">Immagini (AA-1) sulla scheda residenza:</w:t>
+      </w:r>
+    </w:p>
+    <w:p>
+      <w:pPr>
+        <w:numPr>
+          <w:ilvl w:val="0"/>
+          <w:numId w:val="1006"/>
+        </w:numPr>
+        <w:pStyle w:val="Compact"/>
+      </w:pPr>
+      <w:r>
+        <w:rPr>
+          <w:bCs/>
+          <w:b/>
+        </w:rPr>
+        <w:t xml:space="preserve">Testata</w:t>
+      </w:r>
+      <w:r>
+        <w:t xml:space="preserve">: un solo chunk (</w:t>
+      </w:r>
+      <w:r>
+        <w:rPr>
+          <w:rStyle w:val="VerbatimChar"/>
+        </w:rPr>
+        <w:t xml:space="preserve">heading-rsa</w:t>
+      </w:r>
+      <w:r>
+        <w:t xml:space="preserve">) per tutte le residenze, sfondo</w:t>
+      </w:r>
+      <w:r>
+        <w:t xml:space="preserve"> </w:t>
+      </w:r>
+      <w:r>
+        <w:rPr>
+          <w:rStyle w:val="VerbatimChar"/>
+        </w:rPr>
+        <w:t xml:space="preserve">/assets/img/rsa/&lt;alias&gt;.jpg</w:t>
+      </w:r>
+      <w:r>
+        <w:t xml:space="preserve"> </w:t>
+      </w:r>
+      <w:r>
+        <w:t xml:space="preserve">→</w:t>
+      </w:r>
+      <w:r>
+        <w:t xml:space="preserve"> </w:t>
+      </w:r>
+      <w:r>
+        <w:rPr>
+          <w:rStyle w:val="VerbatimChar"/>
+        </w:rPr>
+        <w:t xml:space="preserve">&lt;img&gt;</w:t>
+      </w:r>
+      <w:r>
+        <w:t xml:space="preserve"> </w:t>
+      </w:r>
+      <w:r>
+        <w:t xml:space="preserve">con alt = nome della residenza,</w:t>
+      </w:r>
+      <w:r>
+        <w:t xml:space="preserve"> </w:t>
+      </w:r>
+      <w:r>
+        <w:rPr>
+          <w:rStyle w:val="VerbatimChar"/>
+        </w:rPr>
+        <w:t xml:space="preserve">fetchpriority="high"</w:t>
+      </w:r>
+      <w:r>
+        <w:t xml:space="preserve">,</w:t>
+      </w:r>
+      <w:r>
+        <w:t xml:space="preserve"> </w:t>
+      </w:r>
+      <w:r>
+        <w:rPr>
+          <w:rStyle w:val="VerbatimChar"/>
+        </w:rPr>
+        <w:t xml:space="preserve">object-fit: cover</w:t>
+      </w:r>
+      <w:r>
+        <w:t xml:space="preserve"> </w:t>
+      </w:r>
+      <w:r>
+        <w:t xml:space="preserve">nello stesso contenitore.</w:t>
+      </w:r>
+    </w:p>
+    <w:p>
+      <w:pPr>
+        <w:numPr>
+          <w:ilvl w:val="0"/>
+          <w:numId w:val="1006"/>
+        </w:numPr>
+        <w:pStyle w:val="Compact"/>
+      </w:pPr>
+      <w:r>
+        <w:rPr>
+          <w:bCs/>
+          <w:b/>
+        </w:rPr>
+        <w:t xml:space="preserve">Galleria</w:t>
+      </w:r>
+      <w:r>
+        <w:t xml:space="preserve">: su desktop 3 foto come sfondo, su mobile un carosello che usa già</w:t>
+      </w:r>
+      <w:r>
+        <w:t xml:space="preserve"> </w:t>
+      </w:r>
+      <w:r>
+        <w:rPr>
+          <w:rStyle w:val="VerbatimChar"/>
+        </w:rPr>
+        <w:t xml:space="preserve">&lt;img&gt;</w:t>
+      </w:r>
+      <w:r>
+        <w:t xml:space="preserve"> </w:t>
+      </w:r>
+      <w:r>
+        <w:t xml:space="preserve">(ma senza alt). Con</w:t>
+      </w:r>
+      <w:r>
+        <w:t xml:space="preserve"> </w:t>
+      </w:r>
+      <w:r>
+        <w:t xml:space="preserve">l'indicizzazione mobile-first Google vede già le foto come immagini: basta aggiungere l'alt al carosello; le tre</w:t>
+      </w:r>
+      <w:r>
+        <w:t xml:space="preserve"> </w:t>
+      </w:r>
+      <w:r>
+        <w:t xml:space="preserve">anteprime desktop diventano</w:t>
+      </w:r>
+      <w:r>
+        <w:t xml:space="preserve"> </w:t>
+      </w:r>
+      <w:r>
+        <w:rPr>
+          <w:rStyle w:val="VerbatimChar"/>
+        </w:rPr>
+        <w:t xml:space="preserve">&lt;img&gt;</w:t>
+      </w:r>
+      <w:r>
+        <w:t xml:space="preserve"> </w:t>
+      </w:r>
+      <w:r>
+        <w:t xml:space="preserve">per coerenza.</w:t>
+      </w:r>
+    </w:p>
+    <w:p>
+      <w:pPr>
+        <w:pStyle w:val="FirstParagraph"/>
+      </w:pPr>
+      <w:r>
+        <w:t xml:space="preserve">Esecuzione: contenuti delle residenze e chunk per residenza (</w:t>
+      </w:r>
+      <w:r>
+        <w:rPr>
+          <w:rStyle w:val="VerbatimChar"/>
+        </w:rPr>
+        <w:t xml:space="preserve">gal-*</w:t>
+      </w:r>
+      <w:r>
+        <w:t xml:space="preserve">,</w:t>
+      </w:r>
+      <w:r>
+        <w:t xml:space="preserve"> </w:t>
+      </w:r>
+      <w:r>
+        <w:rPr>
+          <w:rStyle w:val="VerbatimChar"/>
+        </w:rPr>
+        <w:t xml:space="preserve">video-*</w:t>
+      </w:r>
+      <w:r>
+        <w:t xml:space="preserve">) con uno script sul database (tabella di</w:t>
+      </w:r>
+      <w:r>
+        <w:t xml:space="preserve"> </w:t>
+      </w:r>
+      <w:r>
+        <w:t xml:space="preserve">backup, prova con conteggio delle sostituzioni,</w:t>
+      </w:r>
+      <w:r>
+        <w:t xml:space="preserve"> </w:t>
+      </w:r>
+      <w:r>
+        <w:rPr>
+          <w:rStyle w:val="VerbatimChar"/>
+        </w:rPr>
+        <w:t xml:space="preserve">--scrivi</w:t>
+      </w:r>
+      <w:r>
+        <w:t xml:space="preserve">, ripristino); chunk comuni (</w:t>
+      </w:r>
+      <w:r>
+        <w:rPr>
+          <w:rStyle w:val="VerbatimChar"/>
+        </w:rPr>
+        <w:t xml:space="preserve">heading-rsa</w:t>
+      </w:r>
+      <w:r>
+        <w:t xml:space="preserve">,</w:t>
+      </w:r>
+      <w:r>
+        <w:t xml:space="preserve"> </w:t>
+      </w:r>
+      <w:r>
+        <w:rPr>
+          <w:rStyle w:val="VerbatimChar"/>
+        </w:rPr>
+        <w:t xml:space="preserve">form-contatti-hs</w:t>
+      </w:r>
+      <w:r>
+        <w:t xml:space="preserve">,</w:t>
+      </w:r>
+      <w:r>
+        <w:t xml:space="preserve"> </w:t>
+      </w:r>
+      <w:r>
+        <w:rPr>
+          <w:rStyle w:val="VerbatimChar"/>
+        </w:rPr>
+        <w:t xml:space="preserve">footer</w:t>
+      </w:r>
+      <w:r>
+        <w:t xml:space="preserve">, accordion) come elementi statici del repository con l'installer; regola CSS nel foglio di stile del sito.</w:t>
+      </w:r>
+    </w:p>
+    <w:bookmarkEnd w:id="26"/>
+    <w:bookmarkStart w:id="27" w:name="prossimi-passi"/>
+    <w:p>
+      <w:pPr>
+        <w:pStyle w:val="Heading2"/>
+      </w:pPr>
+      <w:r>
+        <w:t xml:space="preserve">Prossimi passi</w:t>
+      </w:r>
+    </w:p>
+    <w:p>
+      <w:pPr>
+        <w:numPr>
+          <w:ilvl w:val="0"/>
+          <w:numId w:val="1007"/>
+        </w:numPr>
+        <w:pStyle w:val="Compact"/>
+      </w:pPr>
+      <w:r>
+        <w:t xml:space="preserve">Estrazione in sola lettura del contenuto delle schede residenza (varianti del markup dell'accordion, intro e</w:t>
+      </w:r>
+      <w:r>
+        <w:t xml:space="preserve"> </w:t>
+      </w:r>
+      <w:r>
+        <w:t xml:space="preserve">contatti) per scrivere lo script di conversione.</w:t>
+      </w:r>
+    </w:p>
+    <w:p>
+      <w:pPr>
+        <w:numPr>
+          <w:ilvl w:val="0"/>
+          <w:numId w:val="1007"/>
+        </w:numPr>
+        <w:pStyle w:val="Compact"/>
+      </w:pPr>
+      <w:r>
+        <w:t xml:space="preserve">Elementi da modificare in</w:t>
+      </w:r>
+      <w:r>
+        <w:t xml:space="preserve"> </w:t>
+      </w:r>
+      <w:r>
+        <w:rPr>
+          <w:rStyle w:val="VerbatimChar"/>
+        </w:rPr>
+        <w:t xml:space="preserve">docs/elementi-sotto-progetto.md</w:t>
+      </w:r>
+      <w:r>
+        <w:t xml:space="preserve">.</w:t>
+      </w:r>
+    </w:p>
+    <w:p>
+      <w:pPr>
+        <w:numPr>
+          <w:ilvl w:val="0"/>
+          <w:numId w:val="1007"/>
+        </w:numPr>
+        <w:pStyle w:val="Compact"/>
+      </w:pPr>
+      <w:r>
         <w:t xml:space="preserve">Sviluppo e collaudo sullo stage AA, poi produzione.</w:t>
       </w:r>
     </w:p>
-    <w:bookmarkEnd w:id="26"/>
     <w:bookmarkEnd w:id="27"/>
+    <w:bookmarkEnd w:id="28"/>
     <w:sectPr/>
   </w:body>
 </w:document>
@@ -1571,6 +2180,12 @@
     <w:abstractNumId w:val="991"/>
   </w:num>
   <w:num w:numId="1005">
+    <w:abstractNumId w:val="991"/>
+  </w:num>
+  <w:num w:numId="1006">
+    <w:abstractNumId w:val="991"/>
+  </w:num>
+  <w:num w:numId="1007">
     <w:abstractNumId w:val="99411"/>
     <w:lvlOverride w:ilvl="0">
       <w:startOverride w:val="1"/>

</xml_diff>

<commit_message>
AA-1 librerie immagini disponibili sul cloud: WebP con GD e Imagick, niente AVIF
Co-Authored-By: Claude Opus 5.5 <noreply@anthropic.com>
Claude-Session: https://claude.ai/code/session_01Rr1X44gsg7BUwMzrRvYrc2
</commit_message>
<xml_diff>
--- a/docs/docx/aa-1-6.docx
+++ b/docs/docx/aa-1-6.docx
@@ -1802,6 +1802,86 @@
       </w:r>
       <w:r>
         <w:t xml:space="preserve">, accordion) come elementi statici del repository con l'installer; regola CSS nel foglio di stile del sito.</w:t>
+      </w:r>
+    </w:p>
+    <w:p>
+      <w:pPr>
+        <w:pStyle w:val="BodyText"/>
+      </w:pPr>
+      <w:r>
+        <w:t xml:space="preserve">Formati (22/10): sul cloud di produzione PHP ha GD con WebP e Imagick (ImageMagick 6.9.10, WebP sì, AVIF no). Le</w:t>
+      </w:r>
+      <w:r>
+        <w:t xml:space="preserve"> </w:t>
+      </w:r>
+      <w:r>
+        <w:t xml:space="preserve">versioni WebP e ridimensionate si generano sul server con uno script ripetibile (Imagick: ridimensionamento di qualità,</w:t>
+      </w:r>
+      <w:r>
+        <w:t xml:space="preserve"> </w:t>
+      </w:r>
+      <w:r>
+        <w:t xml:space="preserve">orientamento EXIF, metadati rimossi), accanto agli originali senza sovrascriverli; markup</w:t>
+      </w:r>
+      <w:r>
+        <w:t xml:space="preserve"> </w:t>
+      </w:r>
+      <w:r>
+        <w:rPr>
+          <w:rStyle w:val="VerbatimChar"/>
+        </w:rPr>
+        <w:t xml:space="preserve">&lt;picture&gt;</w:t>
+      </w:r>
+      <w:r>
+        <w:t xml:space="preserve"> </w:t>
+      </w:r>
+      <w:r>
+        <w:t xml:space="preserve">con WebP e</w:t>
+      </w:r>
+      <w:r>
+        <w:t xml:space="preserve"> </w:t>
+      </w:r>
+      <w:r>
+        <w:t xml:space="preserve">ripiego JPG,</w:t>
+      </w:r>
+      <w:r>
+        <w:t xml:space="preserve"> </w:t>
+      </w:r>
+      <w:r>
+        <w:rPr>
+          <w:rStyle w:val="VerbatimChar"/>
+        </w:rPr>
+        <w:t xml:space="preserve">srcset</w:t>
+      </w:r>
+      <w:r>
+        <w:t xml:space="preserve"> </w:t>
+      </w:r>
+      <w:r>
+        <w:t xml:space="preserve">per le larghezze,</w:t>
+      </w:r>
+      <w:r>
+        <w:t xml:space="preserve"> </w:t>
+      </w:r>
+      <w:r>
+        <w:rPr>
+          <w:rStyle w:val="VerbatimChar"/>
+        </w:rPr>
+        <w:t xml:space="preserve">width</w:t>
+      </w:r>
+      <w:r>
+        <w:t xml:space="preserve">/</w:t>
+      </w:r>
+      <w:r>
+        <w:rPr>
+          <w:rStyle w:val="VerbatimChar"/>
+        </w:rPr>
+        <w:t xml:space="preserve">height</w:t>
+      </w:r>
+      <w:r>
+        <w:t xml:space="preserve"> </w:t>
+      </w:r>
+      <w:r>
+        <w:t xml:space="preserve">espliciti (CLS).</w:t>
       </w:r>
     </w:p>
     <w:bookmarkEnd w:id="26"/>

</xml_diff>

<commit_message>
AA-17 immagini pesanti: tutta la voce nello sprint 2 insieme ad AA-1
Co-Authored-By: Claude Opus 5.5 <noreply@anthropic.com>
Claude-Session: https://claude.ai/code/session_01Rr1X44gsg7BUwMzrRvYrc2
</commit_message>
<xml_diff>
--- a/docs/docx/aa-1-6.docx
+++ b/docs/docx/aa-1-6.docx
@@ -2,7 +2,7 @@
 <file path=word/document.xml><?xml version="1.0" encoding="utf-8"?>
 <w:document xmlns:w="http://schemas.openxmlformats.org/wordprocessingml/2006/main" xmlns:m="http://schemas.openxmlformats.org/officeDocument/2006/math" xmlns:r="http://schemas.openxmlformats.org/officeDocument/2006/relationships" xmlns:o="urn:schemas-microsoft-com:office:office" xmlns:v="urn:schemas-microsoft-com:vml" xmlns:w10="urn:schemas-microsoft-com:office:word" xmlns:a="http://schemas.openxmlformats.org/drawingml/2006/main" xmlns:pic="http://schemas.openxmlformats.org/drawingml/2006/picture" xmlns:wp="http://schemas.openxmlformats.org/drawingml/2006/wordprocessingDrawing">
   <w:body>
-    <w:bookmarkStart w:id="28" w:name="X8e9ac67b548febbf1d60acffc619be74f25e7ad"/>
+    <w:bookmarkStart w:id="29" w:name="X8e9ac67b548febbf1d60acffc619be74f25e7ad"/>
     <w:p>
       <w:pPr>
         <w:pStyle w:val="Heading1"/>
@@ -1885,13 +1885,21 @@
       </w:r>
     </w:p>
     <w:bookmarkEnd w:id="26"/>
-    <w:bookmarkStart w:id="27" w:name="prossimi-passi"/>
+    <w:bookmarkStart w:id="27" w:name="X2ae5d3251de2f5e54eed84e39028809ac762a10"/>
     <w:p>
       <w:pPr>
         <w:pStyle w:val="Heading2"/>
       </w:pPr>
       <w:r>
-        <w:t xml:space="preserve">Prossimi passi</w:t>
+        <w:t xml:space="preserve">AA-17 — Immagini pesanti (deciso il 22/10: tutta la voce, sprint 2)</w:t>
+      </w:r>
+    </w:p>
+    <w:p>
+      <w:pPr>
+        <w:pStyle w:val="FirstParagraph"/>
+      </w:pPr>
+      <w:r>
+        <w:t xml:space="preserve">Le 101 immagini sopra i 200 KB dell'allegato «Immagini Pesanti» (circa 52 MB), non solo quelle convertite con AA-1:</w:t>
       </w:r>
     </w:p>
     <w:p>
@@ -1903,13 +1911,40 @@
         <w:pStyle w:val="Compact"/>
       </w:pPr>
       <w:r>
-        <w:t xml:space="preserve">Estrazione in sola lettura del contenuto delle schede residenza (varianti del markup dell'accordion, intro e</w:t>
-      </w:r>
-      <w:r>
-        <w:t xml:space="preserve"> </w:t>
-      </w:r>
-      <w:r>
-        <w:t xml:space="preserve">contatti) per scrivere lo script di conversione.</w:t>
+        <w:t xml:space="preserve">immagini convertite con AA-1 (testate, schede residenza, gallerie): versioni WebP e ridimensionate accanto</w:t>
+      </w:r>
+      <w:r>
+        <w:t xml:space="preserve"> </w:t>
+      </w:r>
+      <w:r>
+        <w:t xml:space="preserve">all'originale, servite con</w:t>
+      </w:r>
+      <w:r>
+        <w:t xml:space="preserve"> </w:t>
+      </w:r>
+      <w:r>
+        <w:rPr>
+          <w:rStyle w:val="VerbatimChar"/>
+        </w:rPr>
+        <w:t xml:space="preserve">&lt;picture&gt;</w:t>
+      </w:r>
+      <w:r>
+        <w:t xml:space="preserve"> </w:t>
+      </w:r>
+      <w:r>
+        <w:t xml:space="preserve">e</w:t>
+      </w:r>
+      <w:r>
+        <w:t xml:space="preserve"> </w:t>
+      </w:r>
+      <w:r>
+        <w:rPr>
+          <w:rStyle w:val="VerbatimChar"/>
+        </w:rPr>
+        <w:t xml:space="preserve">srcset</w:t>
+      </w:r>
+      <w:r>
+        <w:t xml:space="preserve">;</w:t>
       </w:r>
     </w:p>
     <w:p>
@@ -1921,19 +1956,49 @@
         <w:pStyle w:val="Compact"/>
       </w:pPr>
       <w:r>
-        <w:t xml:space="preserve">Elementi da modificare in</w:t>
-      </w:r>
-      <w:r>
-        <w:t xml:space="preserve"> </w:t>
-      </w:r>
-      <w:r>
-        <w:rPr>
-          <w:rStyle w:val="VerbatimChar"/>
-        </w:rPr>
-        <w:t xml:space="preserve">docs/elementi-sotto-progetto.md</w:t>
-      </w:r>
-      <w:r>
-        <w:t xml:space="preserve">.</w:t>
+        <w:t xml:space="preserve">tutte le altre (immagini delle news, gallerie AA 2025,</w:t>
+      </w:r>
+      <w:r>
+        <w:t xml:space="preserve"> </w:t>
+      </w:r>
+      <w:r>
+        <w:rPr>
+          <w:rStyle w:val="VerbatimChar"/>
+        </w:rPr>
+        <w:t xml:space="preserve">avatar_icon.png</w:t>
+      </w:r>
+      <w:r>
+        <w:t xml:space="preserve"> </w:t>
+      </w:r>
+      <w:r>
+        <w:t xml:space="preserve">dei virtual tour da 2,2 MB, richiamate</w:t>
+      </w:r>
+      <w:r>
+        <w:t xml:space="preserve"> </w:t>
+      </w:r>
+      <w:r>
+        <w:t xml:space="preserve">dall'editor o da librerie esterne con l'URL fisso): ottimizzazione nello stesso file, stesso URL (ridimensionamento</w:t>
+      </w:r>
+      <w:r>
+        <w:t xml:space="preserve"> </w:t>
+      </w:r>
+      <w:r>
+        <w:t xml:space="preserve">alla larghezza massima mostrata, ricompressione), con copia dell'originale in una cartella di backup fuori da</w:t>
+      </w:r>
+      <w:r>
+        <w:t xml:space="preserve"> </w:t>
+      </w:r>
+      <w:r>
+        <w:rPr>
+          <w:rStyle w:val="VerbatimChar"/>
+        </w:rPr>
+        <w:t xml:space="preserve">/www</w:t>
+      </w:r>
+      <w:r>
+        <w:t xml:space="preserve"> </w:t>
+      </w:r>
+      <w:r>
+        <w:t xml:space="preserve">e ripristino;</w:t>
       </w:r>
     </w:p>
     <w:p>
@@ -1945,11 +2010,81 @@
         <w:pStyle w:val="Compact"/>
       </w:pPr>
       <w:r>
+        <w:t xml:space="preserve">stesso script per entrambe le modalità, da rilanciare per le immagini caricate in seguito; verifica finale: nessuna</w:t>
+      </w:r>
+      <w:r>
+        <w:t xml:space="preserve"> </w:t>
+      </w:r>
+      <w:r>
+        <w:t xml:space="preserve">immagine dell'elenco sopra i 200 KB, confronto visivo a campione.</w:t>
+      </w:r>
+    </w:p>
+    <w:bookmarkEnd w:id="27"/>
+    <w:bookmarkStart w:id="28" w:name="prossimi-passi"/>
+    <w:p>
+      <w:pPr>
+        <w:pStyle w:val="Heading2"/>
+      </w:pPr>
+      <w:r>
+        <w:t xml:space="preserve">Prossimi passi</w:t>
+      </w:r>
+    </w:p>
+    <w:p>
+      <w:pPr>
+        <w:numPr>
+          <w:ilvl w:val="0"/>
+          <w:numId w:val="1008"/>
+        </w:numPr>
+        <w:pStyle w:val="Compact"/>
+      </w:pPr>
+      <w:r>
+        <w:t xml:space="preserve">Estrazione in sola lettura del contenuto delle schede residenza (varianti del markup dell'accordion, intro e</w:t>
+      </w:r>
+      <w:r>
+        <w:t xml:space="preserve"> </w:t>
+      </w:r>
+      <w:r>
+        <w:t xml:space="preserve">contatti) per scrivere lo script di conversione.</w:t>
+      </w:r>
+    </w:p>
+    <w:p>
+      <w:pPr>
+        <w:numPr>
+          <w:ilvl w:val="0"/>
+          <w:numId w:val="1008"/>
+        </w:numPr>
+        <w:pStyle w:val="Compact"/>
+      </w:pPr>
+      <w:r>
+        <w:t xml:space="preserve">Elementi da modificare in</w:t>
+      </w:r>
+      <w:r>
+        <w:t xml:space="preserve"> </w:t>
+      </w:r>
+      <w:r>
+        <w:rPr>
+          <w:rStyle w:val="VerbatimChar"/>
+        </w:rPr>
+        <w:t xml:space="preserve">docs/elementi-sotto-progetto.md</w:t>
+      </w:r>
+      <w:r>
+        <w:t xml:space="preserve">.</w:t>
+      </w:r>
+    </w:p>
+    <w:p>
+      <w:pPr>
+        <w:numPr>
+          <w:ilvl w:val="0"/>
+          <w:numId w:val="1008"/>
+        </w:numPr>
+        <w:pStyle w:val="Compact"/>
+      </w:pPr>
+      <w:r>
         <w:t xml:space="preserve">Sviluppo e collaudo sullo stage AA, poi produzione.</w:t>
       </w:r>
     </w:p>
-    <w:bookmarkEnd w:id="27"/>
     <w:bookmarkEnd w:id="28"/>
+    <w:bookmarkEnd w:id="29"/>
     <w:sectPr/>
   </w:body>
 </w:document>
@@ -2266,6 +2401,9 @@
     <w:abstractNumId w:val="991"/>
   </w:num>
   <w:num w:numId="1007">
+    <w:abstractNumId w:val="991"/>
+  </w:num>
+  <w:num w:numId="1008">
     <w:abstractNumId w:val="99411"/>
     <w:lvlOverride w:ilvl="0">
       <w:startOverride w:val="1"/>

</xml_diff>

<commit_message>
AA-1 AA-6 AA-17 pacchetti, ordine di rilascio e collaudo
Co-Authored-By: Claude Opus 5.5 <noreply@anthropic.com>
Claude-Session: https://claude.ai/code/session_01Rr1X44gsg7BUwMzrRvYrc2
</commit_message>
<xml_diff>
--- a/docs/docx/aa-1-6.docx
+++ b/docs/docx/aa-1-6.docx
@@ -2,7 +2,7 @@
 <file path=word/document.xml><?xml version="1.0" encoding="utf-8"?>
 <w:document xmlns:w="http://schemas.openxmlformats.org/wordprocessingml/2006/main" xmlns:m="http://schemas.openxmlformats.org/officeDocument/2006/math" xmlns:r="http://schemas.openxmlformats.org/officeDocument/2006/relationships" xmlns:o="urn:schemas-microsoft-com:office:office" xmlns:v="urn:schemas-microsoft-com:vml" xmlns:w10="urn:schemas-microsoft-com:office:word" xmlns:a="http://schemas.openxmlformats.org/drawingml/2006/main" xmlns:pic="http://schemas.openxmlformats.org/drawingml/2006/picture" xmlns:wp="http://schemas.openxmlformats.org/drawingml/2006/wordprocessingDrawing">
   <w:body>
-    <w:bookmarkStart w:id="29" w:name="X8e9ac67b548febbf1d60acffc619be74f25e7ad"/>
+    <w:bookmarkStart w:id="30" w:name="X8e9ac67b548febbf1d60acffc619be74f25e7ad"/>
     <w:p>
       <w:pPr>
         <w:pStyle w:val="Heading1"/>
@@ -2020,13 +2020,13 @@
       </w:r>
     </w:p>
     <w:bookmarkEnd w:id="27"/>
-    <w:bookmarkStart w:id="28" w:name="prossimi-passi"/>
+    <w:bookmarkStart w:id="28" w:name="pacchetti-e-collaudo-2310"/>
     <w:p>
       <w:pPr>
         <w:pStyle w:val="Heading2"/>
       </w:pPr>
       <w:r>
-        <w:t xml:space="preserve">Prossimi passi</w:t>
+        <w:t xml:space="preserve">Pacchetti e collaudo (23/10)</w:t>
       </w:r>
     </w:p>
     <w:p>
@@ -2038,13 +2038,70 @@
         <w:pStyle w:val="Compact"/>
       </w:pPr>
       <w:r>
-        <w:t xml:space="preserve">Estrazione in sola lettura del contenuto delle schede residenza (varianti del markup dell'accordion, intro e</w:t>
-      </w:r>
-      <w:r>
-        <w:t xml:space="preserve"> </w:t>
-      </w:r>
-      <w:r>
-        <w:t xml:space="preserve">contatti) per scrivere lo script di conversione.</w:t>
+        <w:rPr>
+          <w:rStyle w:val="VerbatimChar"/>
+        </w:rPr>
+        <w:t xml:space="preserve">anniazzurri/deploy/aa-1-17-libreria.json</w:t>
+      </w:r>
+      <w:r>
+        <w:t xml:space="preserve">: libreria</w:t>
+      </w:r>
+      <w:r>
+        <w:t xml:space="preserve"> </w:t>
+      </w:r>
+      <w:r>
+        <w:rPr>
+          <w:rStyle w:val="VerbatimChar"/>
+        </w:rPr>
+        <w:t xml:space="preserve">core/components/kosseogeo/Immagini.php</w:t>
+      </w:r>
+      <w:r>
+        <w:t xml:space="preserve">, snippet</w:t>
+      </w:r>
+      <w:r>
+        <w:t xml:space="preserve"> </w:t>
+      </w:r>
+      <w:r>
+        <w:rPr>
+          <w:rStyle w:val="VerbatimChar"/>
+        </w:rPr>
+        <w:t xml:space="preserve">immagine</w:t>
+      </w:r>
+      <w:r>
+        <w:t xml:space="preserve">,</w:t>
+      </w:r>
+      <w:r>
+        <w:t xml:space="preserve"> </w:t>
+      </w:r>
+      <w:r>
+        <w:t xml:space="preserve">plugin</w:t>
+      </w:r>
+      <w:r>
+        <w:t xml:space="preserve"> </w:t>
+      </w:r>
+      <w:r>
+        <w:rPr>
+          <w:rStyle w:val="VerbatimChar"/>
+        </w:rPr>
+        <w:t xml:space="preserve">ImmaginiCaricamento</w:t>
+      </w:r>
+      <w:r>
+        <w:t xml:space="preserve"> </w:t>
+      </w:r>
+      <w:r>
+        <w:t xml:space="preserve">(OnFileManagerUpload), regole in fondo a</w:t>
+      </w:r>
+      <w:r>
+        <w:t xml:space="preserve"> </w:t>
+      </w:r>
+      <w:r>
+        <w:rPr>
+          <w:rStyle w:val="VerbatimChar"/>
+        </w:rPr>
+        <w:t xml:space="preserve">/dist/css/custom.css</w:t>
+      </w:r>
+      <w:r>
+        <w:t xml:space="preserve">. Nessun effetto visibile.</w:t>
       </w:r>
     </w:p>
     <w:p>
@@ -2056,19 +2113,76 @@
         <w:pStyle w:val="Compact"/>
       </w:pPr>
       <w:r>
-        <w:t xml:space="preserve">Elementi da modificare in</w:t>
-      </w:r>
-      <w:r>
-        <w:t xml:space="preserve"> </w:t>
-      </w:r>
-      <w:r>
-        <w:rPr>
-          <w:rStyle w:val="VerbatimChar"/>
-        </w:rPr>
-        <w:t xml:space="preserve">docs/elementi-sotto-progetto.md</w:t>
-      </w:r>
-      <w:r>
-        <w:t xml:space="preserve">.</w:t>
+        <w:rPr>
+          <w:rStyle w:val="VerbatimChar"/>
+        </w:rPr>
+        <w:t xml:space="preserve">scripts/immagini/ottimizza-immagini.php</w:t>
+      </w:r>
+      <w:r>
+        <w:t xml:space="preserve"> </w:t>
+      </w:r>
+      <w:r>
+        <w:t xml:space="preserve">con</w:t>
+      </w:r>
+      <w:r>
+        <w:t xml:space="preserve"> </w:t>
+      </w:r>
+      <w:r>
+        <w:rPr>
+          <w:rStyle w:val="VerbatimChar"/>
+        </w:rPr>
+        <w:t xml:space="preserve">anniazzurri/dati/aa-17-immagini-pesanti.txt --obiettivo=200</w:t>
+      </w:r>
+      <w:r>
+        <w:t xml:space="preserve">: le 101</w:t>
+      </w:r>
+      <w:r>
+        <w:t xml:space="preserve"> </w:t>
+      </w:r>
+      <w:r>
+        <w:t xml:space="preserve">immagini dell'audit da 51,4 a circa 13 MB (−74%). Restano sopra 200 KB nel file originale alcune foto ad alta</w:t>
+      </w:r>
+      <w:r>
+        <w:t xml:space="preserve"> </w:t>
+      </w:r>
+      <w:r>
+        <w:t xml:space="preserve">risoluzione (testate in</w:t>
+      </w:r>
+      <w:r>
+        <w:t xml:space="preserve"> </w:t>
+      </w:r>
+      <w:r>
+        <w:rPr>
+          <w:rStyle w:val="VerbatimChar"/>
+        </w:rPr>
+        <w:t xml:space="preserve">img/rsa/</w:t>
+      </w:r>
+      <w:r>
+        <w:t xml:space="preserve">, gallerie) e le foto delle regioni salvate in PNG: nelle pagine non si scaricano</w:t>
+      </w:r>
+      <w:r>
+        <w:t xml:space="preserve"> </w:t>
+      </w:r>
+      <w:r>
+        <w:t xml:space="preserve">più gli originali ma le varianti WebP ridimensionate (snippet</w:t>
+      </w:r>
+      <w:r>
+        <w:t xml:space="preserve"> </w:t>
+      </w:r>
+      <w:r>
+        <w:rPr>
+          <w:rStyle w:val="VerbatimChar"/>
+        </w:rPr>
+        <w:t xml:space="preserve">immagine</w:t>
+      </w:r>
+      <w:r>
+        <w:t xml:space="preserve">). Le foto salvate in PNG non vengono</w:t>
+      </w:r>
+      <w:r>
+        <w:t xml:space="preserve"> </w:t>
+      </w:r>
+      <w:r>
+        <w:t xml:space="preserve">ridotte a 256 colori (bande nei cieli e nelle sfumature): solo le grafiche con meno di 4.096 colori.</w:t>
       </w:r>
     </w:p>
     <w:p>
@@ -2080,11 +2194,222 @@
         <w:pStyle w:val="Compact"/>
       </w:pPr>
       <w:r>
+        <w:t xml:space="preserve">Varianti WebP e larghezze generate prima del markup (</w:t>
+      </w:r>
+      <w:r>
+        <w:rPr>
+          <w:rStyle w:val="VerbatimChar"/>
+        </w:rPr>
+        <w:t xml:space="preserve">assets/img</w:t>
+      </w:r>
+      <w:r>
+        <w:t xml:space="preserve">, circa 1.600 immagini; esclusi i virtual tour,</w:t>
+      </w:r>
+      <w:r>
+        <w:t xml:space="preserve"> </w:t>
+      </w:r>
+      <w:r>
+        <w:t xml:space="preserve">25.206 tessere), così nessuna pagina le genera mentre un visitatore la carica.</w:t>
+      </w:r>
+    </w:p>
+    <w:p>
+      <w:pPr>
+        <w:numPr>
+          <w:ilvl w:val="0"/>
+          <w:numId w:val="1008"/>
+        </w:numPr>
+        <w:pStyle w:val="Compact"/>
+      </w:pPr>
+      <w:r>
+        <w:rPr>
+          <w:rStyle w:val="VerbatimChar"/>
+        </w:rPr>
+        <w:t xml:space="preserve">anniazzurri/deploy/aa-1-6-markup.json</w:t>
+      </w:r>
+      <w:r>
+        <w:t xml:space="preserve">: 152 chunk e template (sfondi, foto delle regioni, titoli), generati da</w:t>
+      </w:r>
+      <w:r>
+        <w:t xml:space="preserve"> </w:t>
+      </w:r>
+      <w:r>
+        <w:rPr>
+          <w:rStyle w:val="VerbatimChar"/>
+        </w:rPr>
+        <w:t xml:space="preserve">scripts/immagini/converti-sfondi.py</w:t>
+      </w:r>
+      <w:r>
+        <w:t xml:space="preserve"> </w:t>
+      </w:r>
+      <w:r>
+        <w:t xml:space="preserve">e</w:t>
+      </w:r>
+      <w:r>
+        <w:t xml:space="preserve"> </w:t>
+      </w:r>
+      <w:r>
+        <w:rPr>
+          <w:rStyle w:val="VerbatimChar"/>
+        </w:rPr>
+        <w:t xml:space="preserve">scripts/titoli/converti-titoli.py</w:t>
+      </w:r>
+      <w:r>
+        <w:t xml:space="preserve"> </w:t>
+      </w:r>
+      <w:r>
+        <w:t xml:space="preserve">a partire dalla baseline.</w:t>
+      </w:r>
+    </w:p>
+    <w:p>
+      <w:pPr>
+        <w:numPr>
+          <w:ilvl w:val="0"/>
+          <w:numId w:val="1008"/>
+        </w:numPr>
+        <w:pStyle w:val="Compact"/>
+      </w:pPr>
+      <w:r>
+        <w:rPr>
+          <w:rStyle w:val="VerbatimChar"/>
+        </w:rPr>
+        <w:t xml:space="preserve">scripts/deploy/aggiorna-contenuti.php</w:t>
+      </w:r>
+      <w:r>
+        <w:t xml:space="preserve"> </w:t>
+      </w:r>
+      <w:r>
+        <w:t xml:space="preserve">con</w:t>
+      </w:r>
+      <w:r>
+        <w:t xml:space="preserve"> </w:t>
+      </w:r>
+      <w:r>
+        <w:rPr>
+          <w:rStyle w:val="VerbatimChar"/>
+        </w:rPr>
+        <w:t xml:space="preserve">anniazzurri/dati/aa-6-contenuti/</w:t>
+      </w:r>
+      <w:r>
+        <w:t xml:space="preserve">: 75 contenuti (62 residenze, 5 centri</w:t>
+      </w:r>
+      <w:r>
+        <w:t xml:space="preserve"> </w:t>
+      </w:r>
+      <w:r>
+        <w:t xml:space="preserve">diurni, 8 regioni), tabella di backup e ripristino; si ferma sulle pagine modificate dopo l'esportazione.</w:t>
+      </w:r>
+    </w:p>
+    <w:p>
+      <w:pPr>
+        <w:numPr>
+          <w:ilvl w:val="0"/>
+          <w:numId w:val="1008"/>
+        </w:numPr>
+        <w:pStyle w:val="Compact"/>
+      </w:pPr>
+      <w:r>
+        <w:t xml:space="preserve">Ordine: libreria → AA-17 → varianti → markup → contenuti. Collaudo:</w:t>
+      </w:r>
+      <w:r>
+        <w:t xml:space="preserve"> </w:t>
+      </w:r>
+      <w:r>
+        <w:rPr>
+          <w:rStyle w:val="VerbatimChar"/>
+        </w:rPr>
+        <w:t xml:space="preserve">scripts/checks/aa-ispezione-sprint2.php</w:t>
+      </w:r>
+      <w:r>
+        <w:t xml:space="preserve"> </w:t>
+      </w:r>
+      <w:r>
+        <w:t xml:space="preserve">sullo</w:t>
+      </w:r>
+      <w:r>
+        <w:t xml:space="preserve"> </w:t>
+      </w:r>
+      <w:r>
+        <w:t xml:space="preserve">stage (sfondi di contenuto → 0, H2 senza «Guarda meno/di più», alt), confronto visivo desktop e mobile delle pagine</w:t>
+      </w:r>
+      <w:r>
+        <w:t xml:space="preserve"> </w:t>
+      </w:r>
+      <w:r>
+        <w:t xml:space="preserve">tipo (home, regione, provincia, residenza, centro diurno, news, pagine interne), caricamento di un'immagine dal</w:t>
+      </w:r>
+      <w:r>
+        <w:t xml:space="preserve"> </w:t>
+      </w:r>
+      <w:r>
+        <w:t xml:space="preserve">gestore file (plugin).</w:t>
+      </w:r>
+    </w:p>
+    <w:bookmarkEnd w:id="28"/>
+    <w:bookmarkStart w:id="29" w:name="prossimi-passi"/>
+    <w:p>
+      <w:pPr>
+        <w:pStyle w:val="Heading2"/>
+      </w:pPr>
+      <w:r>
+        <w:t xml:space="preserve">Prossimi passi</w:t>
+      </w:r>
+    </w:p>
+    <w:p>
+      <w:pPr>
+        <w:numPr>
+          <w:ilvl w:val="0"/>
+          <w:numId w:val="1009"/>
+        </w:numPr>
+        <w:pStyle w:val="Compact"/>
+      </w:pPr>
+      <w:r>
+        <w:t xml:space="preserve">Estrazione in sola lettura del contenuto delle schede residenza (varianti del markup dell'accordion, intro e</w:t>
+      </w:r>
+      <w:r>
+        <w:t xml:space="preserve"> </w:t>
+      </w:r>
+      <w:r>
+        <w:t xml:space="preserve">contatti) per scrivere lo script di conversione.</w:t>
+      </w:r>
+    </w:p>
+    <w:p>
+      <w:pPr>
+        <w:numPr>
+          <w:ilvl w:val="0"/>
+          <w:numId w:val="1009"/>
+        </w:numPr>
+        <w:pStyle w:val="Compact"/>
+      </w:pPr>
+      <w:r>
+        <w:t xml:space="preserve">Elementi da modificare in</w:t>
+      </w:r>
+      <w:r>
+        <w:t xml:space="preserve"> </w:t>
+      </w:r>
+      <w:r>
+        <w:rPr>
+          <w:rStyle w:val="VerbatimChar"/>
+        </w:rPr>
+        <w:t xml:space="preserve">docs/elementi-sotto-progetto.md</w:t>
+      </w:r>
+      <w:r>
+        <w:t xml:space="preserve">.</w:t>
+      </w:r>
+    </w:p>
+    <w:p>
+      <w:pPr>
+        <w:numPr>
+          <w:ilvl w:val="0"/>
+          <w:numId w:val="1009"/>
+        </w:numPr>
+        <w:pStyle w:val="Compact"/>
+      </w:pPr>
+      <w:r>
         <w:t xml:space="preserve">Sviluppo e collaudo sullo stage AA, poi produzione.</w:t>
       </w:r>
     </w:p>
-    <w:bookmarkEnd w:id="28"/>
     <w:bookmarkEnd w:id="29"/>
+    <w:bookmarkEnd w:id="30"/>
     <w:sectPr/>
   </w:body>
 </w:document>
@@ -2404,6 +2729,9 @@
     <w:abstractNumId w:val="991"/>
   </w:num>
   <w:num w:numId="1008">
+    <w:abstractNumId w:val="991"/>
+  </w:num>
+  <w:num w:numId="1009">
     <w:abstractNumId w:val="99411"/>
     <w:lvlOverride w:ilvl="0">
       <w:startOverride w:val="1"/>

</xml_diff>

<commit_message>
AA-1 AA-17 immagini delle news in WebP con lo snippet immagine
Elenchi (news-list-item, news-home-desktop, news-home-mobile, pdoListItem) e testa
dell'articolo (interna-articolo, albero-dei-ricordi, interna-speaker-per-un-giorno):
<picture> con WebP e srcset; immagine dell'articolo non più ripetuta per desktop e mobile.
CSS: picture trasparente nelle card, altezza automatica della card-img-top.

Co-Authored-By: Claude Opus 5.5 <noreply@anthropic.com>
Claude-Session: https://claude.ai/code/session_01Rr1X44gsg7BUwMzrRvYrc2
</commit_message>
<xml_diff>
--- a/docs/docx/aa-1-6.docx
+++ b/docs/docx/aa-1-6.docx
@@ -2227,7 +2227,7 @@
         <w:t xml:space="preserve">anniazzurri/deploy/aa-1-6-markup.json</w:t>
       </w:r>
       <w:r>
-        <w:t xml:space="preserve">: 152 chunk e template (sfondi, foto delle regioni, titoli), generati da</w:t>
+        <w:t xml:space="preserve">: chunk e template (sfondi, foto delle regioni, titoli), generati da</w:t>
       </w:r>
       <w:r>
         <w:t xml:space="preserve"> </w:t>
@@ -2258,6 +2258,165 @@
       </w:r>
       <w:r>
         <w:t xml:space="preserve">a partire dalla baseline.</w:t>
+      </w:r>
+    </w:p>
+    <w:p>
+      <w:pPr>
+        <w:numPr>
+          <w:ilvl w:val="0"/>
+          <w:numId w:val="1008"/>
+        </w:numPr>
+        <w:pStyle w:val="Compact"/>
+      </w:pPr>
+      <w:r>
+        <w:t xml:space="preserve">Immagini delle news (aggiunte il 23/10): l'immagine della news (TV</w:t>
+      </w:r>
+      <w:r>
+        <w:t xml:space="preserve"> </w:t>
+      </w:r>
+      <w:r>
+        <w:rPr>
+          <w:rStyle w:val="VerbatimChar"/>
+        </w:rPr>
+        <w:t xml:space="preserve">newsImage</w:t>
+      </w:r>
+      <w:r>
+        <w:t xml:space="preserve">) negli elenchi (</w:t>
+      </w:r>
+      <w:r>
+        <w:rPr>
+          <w:rStyle w:val="VerbatimChar"/>
+        </w:rPr>
+        <w:t xml:space="preserve">news-list-item</w:t>
+      </w:r>
+      <w:r>
+        <w:t xml:space="preserve">,</w:t>
+      </w:r>
+      <w:r>
+        <w:t xml:space="preserve"> </w:t>
+      </w:r>
+      <w:r>
+        <w:rPr>
+          <w:rStyle w:val="VerbatimChar"/>
+        </w:rPr>
+        <w:t xml:space="preserve">news-home-desktop</w:t>
+      </w:r>
+      <w:r>
+        <w:t xml:space="preserve">,</w:t>
+      </w:r>
+      <w:r>
+        <w:t xml:space="preserve"> </w:t>
+      </w:r>
+      <w:r>
+        <w:rPr>
+          <w:rStyle w:val="VerbatimChar"/>
+        </w:rPr>
+        <w:t xml:space="preserve">news-home-mobile</w:t>
+      </w:r>
+      <w:r>
+        <w:t xml:space="preserve">,</w:t>
+      </w:r>
+      <w:r>
+        <w:t xml:space="preserve"> </w:t>
+      </w:r>
+      <w:r>
+        <w:rPr>
+          <w:rStyle w:val="VerbatimChar"/>
+        </w:rPr>
+        <w:t xml:space="preserve">pdoListItem</w:t>
+      </w:r>
+      <w:r>
+        <w:t xml:space="preserve">) e in testa all'articolo (</w:t>
+      </w:r>
+      <w:r>
+        <w:rPr>
+          <w:rStyle w:val="VerbatimChar"/>
+        </w:rPr>
+        <w:t xml:space="preserve">interna-articolo</w:t>
+      </w:r>
+      <w:r>
+        <w:t xml:space="preserve">,</w:t>
+      </w:r>
+      <w:r>
+        <w:t xml:space="preserve"> </w:t>
+      </w:r>
+      <w:r>
+        <w:rPr>
+          <w:rStyle w:val="VerbatimChar"/>
+        </w:rPr>
+        <w:t xml:space="preserve">albero-dei-ricordi</w:t>
+      </w:r>
+      <w:r>
+        <w:t xml:space="preserve">,</w:t>
+      </w:r>
+      <w:r>
+        <w:t xml:space="preserve"> </w:t>
+      </w:r>
+      <w:r>
+        <w:rPr>
+          <w:rStyle w:val="VerbatimChar"/>
+        </w:rPr>
+        <w:t xml:space="preserve">interna-speaker-per-un-giorno</w:t>
+      </w:r>
+      <w:r>
+        <w:t xml:space="preserve">) passa dallo snippet</w:t>
+      </w:r>
+      <w:r>
+        <w:t xml:space="preserve"> </w:t>
+      </w:r>
+      <w:r>
+        <w:rPr>
+          <w:rStyle w:val="VerbatimChar"/>
+        </w:rPr>
+        <w:t xml:space="preserve">immagine</w:t>
+      </w:r>
+      <w:r>
+        <w:t xml:space="preserve">: WebP con</w:t>
+      </w:r>
+      <w:r>
+        <w:t xml:space="preserve"> </w:t>
+      </w:r>
+      <w:r>
+        <w:rPr>
+          <w:rStyle w:val="VerbatimChar"/>
+        </w:rPr>
+        <w:t xml:space="preserve">srcset</w:t>
+      </w:r>
+      <w:r>
+        <w:t xml:space="preserve">,</w:t>
+      </w:r>
+      <w:r>
+        <w:t xml:space="preserve"> </w:t>
+      </w:r>
+      <w:r>
+        <w:t xml:space="preserve">caricamento differito negli elenchi, priorità alta in testa all'articolo. L'immagine dell'articolo era ripetuta due</w:t>
+      </w:r>
+      <w:r>
+        <w:t xml:space="preserve"> </w:t>
+      </w:r>
+      <w:r>
+        <w:t xml:space="preserve">volte (desktop e mobile, stesso file): ora una sola. Le immagini nel testo degli articoli restano</w:t>
+      </w:r>
+      <w:r>
+        <w:t xml:space="preserve"> </w:t>
+      </w:r>
+      <w:r>
+        <w:rPr>
+          <w:rStyle w:val="VerbatimChar"/>
+        </w:rPr>
+        <w:t xml:space="preserve">&lt;img&gt;</w:t>
+      </w:r>
+      <w:r>
+        <w:t xml:space="preserve"> </w:t>
+      </w:r>
+      <w:r>
+        <w:t xml:space="preserve">dell'editor,</w:t>
+      </w:r>
+      <w:r>
+        <w:t xml:space="preserve"> </w:t>
+      </w:r>
+      <w:r>
+        <w:t xml:space="preserve">ottimizzate nello stesso file (AA-17 e plugin di caricamento).</w:t>
       </w:r>
     </w:p>
     <w:p>

</xml_diff>

<commit_message>
AA-1 AA-17 Alt Text: documentazione di immagini delle news, alt e angoli arrotondati (stage 23/10)
Co-Authored-By: Claude Opus 5.5 <noreply@anthropic.com>
Claude-Session: https://claude.ai/code/session_01Rr1X44gsg7BUwMzrRvYrc2
</commit_message>
<xml_diff>
--- a/docs/docx/aa-1-6.docx
+++ b/docs/docx/aa-1-6.docx
@@ -2428,34 +2428,82 @@
         <w:pStyle w:val="Compact"/>
       </w:pPr>
       <w:r>
-        <w:rPr>
-          <w:rStyle w:val="VerbatimChar"/>
-        </w:rPr>
-        <w:t xml:space="preserve">scripts/deploy/aggiorna-contenuti.php</w:t>
-      </w:r>
-      <w:r>
-        <w:t xml:space="preserve"> </w:t>
-      </w:r>
-      <w:r>
-        <w:t xml:space="preserve">con</w:t>
-      </w:r>
-      <w:r>
-        <w:t xml:space="preserve"> </w:t>
-      </w:r>
-      <w:r>
-        <w:rPr>
-          <w:rStyle w:val="VerbatimChar"/>
-        </w:rPr>
-        <w:t xml:space="preserve">anniazzurri/dati/aa-6-contenuti/</w:t>
-      </w:r>
-      <w:r>
-        <w:t xml:space="preserve">: 75 contenuti (62 residenze, 5 centri</w:t>
-      </w:r>
-      <w:r>
-        <w:t xml:space="preserve"> </w:t>
-      </w:r>
-      <w:r>
-        <w:t xml:space="preserve">diurni, 8 regioni), tabella di backup e ripristino; si ferma sulle pagine modificate dopo l'esportazione.</w:t>
+        <w:t xml:space="preserve">Alt Text delle immagini nel testo delle news (misura del 23/10 con</w:t>
+      </w:r>
+      <w:r>
+        <w:t xml:space="preserve"> </w:t>
+      </w:r>
+      <w:r>
+        <w:rPr>
+          <w:rStyle w:val="VerbatimChar"/>
+        </w:rPr>
+        <w:t xml:space="preserve">scripts/checks/aa-immagini-news.php</w:t>
+      </w:r>
+      <w:r>
+        <w:t xml:space="preserve">: 129 immagini</w:t>
+      </w:r>
+      <w:r>
+        <w:t xml:space="preserve"> </w:t>
+      </w:r>
+      <w:r>
+        <w:t xml:space="preserve">in 28 articoli su 270, media 55 KB, nessuna sopra 200 KB, 37 senza alt): i 37 alt scritti guardando le immagini e</w:t>
+      </w:r>
+      <w:r>
+        <w:t xml:space="preserve"> </w:t>
+      </w:r>
+      <w:r>
+        <w:t xml:space="preserve">verificati da Danilo (residenze e persone indicate nel testo degli articoli) sono in</w:t>
+      </w:r>
+      <w:r>
+        <w:t xml:space="preserve"> </w:t>
+      </w:r>
+      <w:r>
+        <w:rPr>
+          <w:rStyle w:val="VerbatimChar"/>
+        </w:rPr>
+        <w:t xml:space="preserve">anniazzurri/dati/alt-immagini.tsv</w:t>
+      </w:r>
+      <w:r>
+        <w:t xml:space="preserve">;</w:t>
+      </w:r>
+      <w:r>
+        <w:t xml:space="preserve"> </w:t>
+      </w:r>
+      <w:r>
+        <w:rPr>
+          <w:rStyle w:val="VerbatimChar"/>
+        </w:rPr>
+        <w:t xml:space="preserve">anniazzurri/dati/alt-news-contenuti/</w:t>
+      </w:r>
+      <w:r>
+        <w:t xml:space="preserve"> </w:t>
+      </w:r>
+      <w:r>
+        <w:t xml:space="preserve">(7 articoli, generato dall'esportazione di produzione con</w:t>
+      </w:r>
+      <w:r>
+        <w:t xml:space="preserve"> </w:t>
+      </w:r>
+      <w:r>
+        <w:rPr>
+          <w:rStyle w:val="VerbatimChar"/>
+        </w:rPr>
+        <w:t xml:space="preserve">scripts/immagini/applica-alt-contenuti.py</w:t>
+      </w:r>
+      <w:r>
+        <w:t xml:space="preserve">) li aggiunge solo dove l'alt manca, con</w:t>
+      </w:r>
+      <w:r>
+        <w:t xml:space="preserve"> </w:t>
+      </w:r>
+      <w:r>
+        <w:rPr>
+          <w:rStyle w:val="VerbatimChar"/>
+        </w:rPr>
+        <w:t xml:space="preserve">aggiorna-contenuti.php</w:t>
+      </w:r>
+      <w:r>
+        <w:t xml:space="preserve">.</w:t>
       </w:r>
     </w:p>
     <w:p>
@@ -2467,7 +2515,91 @@
         <w:pStyle w:val="Compact"/>
       </w:pPr>
       <w:r>
-        <w:t xml:space="preserve">Ordine: libreria → AA-17 → varianti → markup → contenuti. Collaudo:</w:t>
+        <w:t xml:space="preserve">Angoli arrotondati: il</w:t>
+      </w:r>
+      <w:r>
+        <w:t xml:space="preserve"> </w:t>
+      </w:r>
+      <w:r>
+        <w:rPr>
+          <w:rStyle w:val="VerbatimChar"/>
+        </w:rPr>
+        <w:t xml:space="preserve">&lt;picture&gt;</w:t>
+      </w:r>
+      <w:r>
+        <w:t xml:space="preserve"> </w:t>
+      </w:r>
+      <w:r>
+        <w:t xml:space="preserve">che contiene un'immagine-sfondo eredita il raggio del contenitore (testata delle</w:t>
+      </w:r>
+      <w:r>
+        <w:t xml:space="preserve"> </w:t>
+      </w:r>
+      <w:r>
+        <w:t xml:space="preserve">news, schede e card con</w:t>
+      </w:r>
+      <w:r>
+        <w:t xml:space="preserve"> </w:t>
+      </w:r>
+      <w:r>
+        <w:rPr>
+          <w:rStyle w:val="VerbatimChar"/>
+        </w:rPr>
+        <w:t xml:space="preserve">rounded-*</w:t>
+      </w:r>
+      <w:r>
+        <w:t xml:space="preserve">).</w:t>
+      </w:r>
+    </w:p>
+    <w:p>
+      <w:pPr>
+        <w:numPr>
+          <w:ilvl w:val="0"/>
+          <w:numId w:val="1008"/>
+        </w:numPr>
+        <w:pStyle w:val="Compact"/>
+      </w:pPr>
+      <w:r>
+        <w:rPr>
+          <w:rStyle w:val="VerbatimChar"/>
+        </w:rPr>
+        <w:t xml:space="preserve">scripts/deploy/aggiorna-contenuti.php</w:t>
+      </w:r>
+      <w:r>
+        <w:t xml:space="preserve"> </w:t>
+      </w:r>
+      <w:r>
+        <w:t xml:space="preserve">con</w:t>
+      </w:r>
+      <w:r>
+        <w:t xml:space="preserve"> </w:t>
+      </w:r>
+      <w:r>
+        <w:rPr>
+          <w:rStyle w:val="VerbatimChar"/>
+        </w:rPr>
+        <w:t xml:space="preserve">anniazzurri/dati/aa-6-contenuti/</w:t>
+      </w:r>
+      <w:r>
+        <w:t xml:space="preserve">: 75 contenuti (62 residenze, 5 centri</w:t>
+      </w:r>
+      <w:r>
+        <w:t xml:space="preserve"> </w:t>
+      </w:r>
+      <w:r>
+        <w:t xml:space="preserve">diurni, 8 regioni), tabella di backup e ripristino; si ferma sulle pagine modificate dopo l'esportazione.</w:t>
+      </w:r>
+    </w:p>
+    <w:p>
+      <w:pPr>
+        <w:numPr>
+          <w:ilvl w:val="0"/>
+          <w:numId w:val="1008"/>
+        </w:numPr>
+        <w:pStyle w:val="Compact"/>
+      </w:pPr>
+      <w:r>
+        <w:t xml:space="preserve">Ordine: libreria → AA-17 → varianti → markup → contenuti → alt delle news. Collaudo:</w:t>
       </w:r>
       <w:r>
         <w:t xml:space="preserve"> </w:t>

</xml_diff>

<commit_message>
AA-1 AA-6 AA-17 Alt Text: documentazione del collaudo visivo e delle correzioni; elenco rapido per il collaudo
Co-Authored-By: Claude Opus 5.5 <noreply@anthropic.com>
Claude-Session: https://claude.ai/code/session_01Rr1X44gsg7BUwMzrRvYrc2
</commit_message>
<xml_diff>
--- a/docs/docx/aa-1-6.docx
+++ b/docs/docx/aa-1-6.docx
@@ -2560,34 +2560,193 @@
         <w:pStyle w:val="Compact"/>
       </w:pPr>
       <w:r>
-        <w:rPr>
-          <w:rStyle w:val="VerbatimChar"/>
-        </w:rPr>
-        <w:t xml:space="preserve">scripts/deploy/aggiorna-contenuti.php</w:t>
-      </w:r>
-      <w:r>
-        <w:t xml:space="preserve"> </w:t>
-      </w:r>
-      <w:r>
-        <w:t xml:space="preserve">con</w:t>
-      </w:r>
-      <w:r>
-        <w:t xml:space="preserve"> </w:t>
-      </w:r>
-      <w:r>
-        <w:rPr>
-          <w:rStyle w:val="VerbatimChar"/>
-        </w:rPr>
-        <w:t xml:space="preserve">anniazzurri/dati/aa-6-contenuti/</w:t>
-      </w:r>
-      <w:r>
-        <w:t xml:space="preserve">: 75 contenuti (62 residenze, 5 centri</w:t>
-      </w:r>
-      <w:r>
-        <w:t xml:space="preserve"> </w:t>
-      </w:r>
-      <w:r>
-        <w:t xml:space="preserve">diurni, 8 regioni), tabella di backup e ripristino; si ferma sulle pagine modificate dopo l'esportazione.</w:t>
+        <w:t xml:space="preserve">Collaudo visivo stage/produzione a 390, 768, 1366 e 1920 px su 50 pagine (</w:t>
+      </w:r>
+      <w:r>
+        <w:rPr>
+          <w:rStyle w:val="VerbatimChar"/>
+        </w:rPr>
+        <w:t xml:space="preserve">scripts/collaudo/</w:t>
+      </w:r>
+      <w:r>
+        <w:t xml:space="preserve">, 23-24/10), con le</w:t>
+      </w:r>
+      <w:r>
+        <w:t xml:space="preserve"> </w:t>
+      </w:r>
+      <w:r>
+        <w:t xml:space="preserve">correzioni emerse:</w:t>
+      </w:r>
+    </w:p>
+    <w:p>
+      <w:pPr>
+        <w:numPr>
+          <w:ilvl w:val="1"/>
+          <w:numId w:val="1009"/>
+        </w:numPr>
+        <w:pStyle w:val="Compact"/>
+      </w:pPr>
+      <w:r>
+        <w:t xml:space="preserve">home inglese (pagina senza template, carica solo</w:t>
+      </w:r>
+      <w:r>
+        <w:t xml:space="preserve"> </w:t>
+      </w:r>
+      <w:r>
+        <w:rPr>
+          <w:rStyle w:val="VerbatimChar"/>
+        </w:rPr>
+        <w:t xml:space="preserve">app.css</w:t>
+      </w:r>
+      <w:r>
+        <w:t xml:space="preserve">): aggiunto</w:t>
+      </w:r>
+      <w:r>
+        <w:t xml:space="preserve"> </w:t>
+      </w:r>
+      <w:r>
+        <w:rPr>
+          <w:rStyle w:val="VerbatimChar"/>
+        </w:rPr>
+        <w:t xml:space="preserve">kos-seo-geo.css</w:t>
+      </w:r>
+      <w:r>
+        <w:t xml:space="preserve"> </w:t>
+      </w:r>
+      <w:r>
+        <w:t xml:space="preserve">e alt in inglese</w:t>
+      </w:r>
+      <w:r>
+        <w:t xml:space="preserve"> </w:t>
+      </w:r>
+      <w:r>
+        <w:t xml:space="preserve">(</w:t>
+      </w:r>
+      <w:r>
+        <w:rPr>
+          <w:rStyle w:val="VerbatimChar"/>
+        </w:rPr>
+        <w:t xml:space="preserve">anniazzurri/dati/alt-immagini-en.tsv</w:t>
+      </w:r>
+      <w:r>
+        <w:t xml:space="preserve">);</w:t>
+      </w:r>
+    </w:p>
+    <w:p>
+      <w:pPr>
+        <w:numPr>
+          <w:ilvl w:val="1"/>
+          <w:numId w:val="1009"/>
+        </w:numPr>
+        <w:pStyle w:val="Compact"/>
+      </w:pPr>
+      <w:r>
+        <w:t xml:space="preserve">paragrafi-titolo: tolta la regola sui margini (il tema dà già alle classi</w:t>
+      </w:r>
+      <w:r>
+        <w:t xml:space="preserve"> </w:t>
+      </w:r>
+      <w:r>
+        <w:rPr>
+          <w:rStyle w:val="VerbatimChar"/>
+        </w:rPr>
+        <w:t xml:space="preserve">.h1</w:t>
+      </w:r>
+      <w:r>
+        <w:t xml:space="preserve">-</w:t>
+      </w:r>
+      <w:r>
+        <w:rPr>
+          <w:rStyle w:val="VerbatimChar"/>
+        </w:rPr>
+        <w:t xml:space="preserve">.h5</w:t>
+      </w:r>
+      <w:r>
+        <w:t xml:space="preserve"> </w:t>
+      </w:r>
+      <w:r>
+        <w:t xml:space="preserve">i margini dei titoli);</w:t>
+      </w:r>
+      <w:r>
+        <w:t xml:space="preserve"> </w:t>
+      </w:r>
+      <w:r>
+        <w:t xml:space="preserve">ripristinata la dimensione della frase della newsletter nel footer (</w:t>
+      </w:r>
+      <w:r>
+        <w:rPr>
+          <w:rStyle w:val="VerbatimChar"/>
+        </w:rPr>
+        <w:t xml:space="preserve">footer[stripe-footer] p</w:t>
+      </w:r>
+      <w:r>
+        <w:t xml:space="preserve"> </w:t>
+      </w:r>
+      <w:r>
+        <w:t xml:space="preserve">del tema);</w:t>
+      </w:r>
+    </w:p>
+    <w:p>
+      <w:pPr>
+        <w:numPr>
+          <w:ilvl w:val="1"/>
+          <w:numId w:val="1009"/>
+        </w:numPr>
+        <w:pStyle w:val="Compact"/>
+      </w:pPr>
+      <w:r>
+        <w:t xml:space="preserve">gallerie su telefono e tablet: foto del carosello senza caricamento differito (</w:t>
+      </w:r>
+      <w:r>
+        <w:rPr>
+          <w:rStyle w:val="VerbatimChar"/>
+        </w:rPr>
+        <w:t xml:space="preserve">&amp;differita=</w:t>
+      </w:r>
+      <w:r>
+        <w:t xml:space="preserve">0``), Flickity con</w:t>
+      </w:r>
+      <w:r>
+        <w:t xml:space="preserve"> </w:t>
+      </w:r>
+      <w:r>
+        <w:rPr>
+          <w:rStyle w:val="VerbatimChar"/>
+        </w:rPr>
+        <w:t xml:space="preserve">imagesLoaded</w:t>
+      </w:r>
+      <w:r>
+        <w:t xml:space="preserve"> </w:t>
+      </w:r>
+      <w:r>
+        <w:t xml:space="preserve">e rimisura a pagina caricata (prima il carosello restava chiuso a 0 px).</w:t>
+      </w:r>
+      <w:r>
+        <w:t xml:space="preserve"> </w:t>
+      </w:r>
+      <w:r>
+        <w:t xml:space="preserve">Esito: altezze delle pagine uguali alla produzione; differenze residue solo nel ricampionamento delle foto in WebP e</w:t>
+      </w:r>
+      <w:r>
+        <w:t xml:space="preserve"> </w:t>
+      </w:r>
+      <w:r>
+        <w:t xml:space="preserve">su</w:t>
+      </w:r>
+      <w:r>
+        <w:t xml:space="preserve"> </w:t>
+      </w:r>
+      <w:r>
+        <w:rPr>
+          <w:rStyle w:val="VerbatimChar"/>
+        </w:rPr>
+        <w:t xml:space="preserve">/azzurramente</w:t>
+      </w:r>
+      <w:r>
+        <w:t xml:space="preserve"> </w:t>
+      </w:r>
+      <w:r>
+        <w:t xml:space="preserve">(widget di terze parti presenti solo in produzione).</w:t>
       </w:r>
     </w:p>
     <w:p>
@@ -2599,6 +2758,75 @@
         <w:pStyle w:val="Compact"/>
       </w:pPr>
       <w:r>
+        <w:t xml:space="preserve">Alt Text, completamento: icone decorative accanto ai numeri con</w:t>
+      </w:r>
+      <w:r>
+        <w:t xml:space="preserve"> </w:t>
+      </w:r>
+      <w:r>
+        <w:rPr>
+          <w:rStyle w:val="VerbatimChar"/>
+        </w:rPr>
+        <w:t xml:space="preserve">alt=""</w:t>
+      </w:r>
+      <w:r>
+        <w:t xml:space="preserve">; foto dei direttori con nome e ruolo scritti</w:t>
+      </w:r>
+      <w:r>
+        <w:t xml:space="preserve"> </w:t>
+      </w:r>
+      <w:r>
+        <w:t xml:space="preserve">sotto la foto (85 pagine); foto degli speaker con nome e residenza (36).</w:t>
+      </w:r>
+    </w:p>
+    <w:p>
+      <w:pPr>
+        <w:numPr>
+          <w:ilvl w:val="0"/>
+          <w:numId w:val="1008"/>
+        </w:numPr>
+        <w:pStyle w:val="Compact"/>
+      </w:pPr>
+      <w:r>
+        <w:rPr>
+          <w:rStyle w:val="VerbatimChar"/>
+        </w:rPr>
+        <w:t xml:space="preserve">scripts/deploy/aggiorna-contenuti.php</w:t>
+      </w:r>
+      <w:r>
+        <w:t xml:space="preserve"> </w:t>
+      </w:r>
+      <w:r>
+        <w:t xml:space="preserve">con</w:t>
+      </w:r>
+      <w:r>
+        <w:t xml:space="preserve"> </w:t>
+      </w:r>
+      <w:r>
+        <w:rPr>
+          <w:rStyle w:val="VerbatimChar"/>
+        </w:rPr>
+        <w:t xml:space="preserve">anniazzurri/dati/aa-6-contenuti/</w:t>
+      </w:r>
+      <w:r>
+        <w:t xml:space="preserve">: 75 contenuti (62 residenze, 5 centri</w:t>
+      </w:r>
+      <w:r>
+        <w:t xml:space="preserve"> </w:t>
+      </w:r>
+      <w:r>
+        <w:t xml:space="preserve">diurni, 8 regioni), tabella di backup e ripristino; si ferma sulle pagine modificate dopo l'esportazione.</w:t>
+      </w:r>
+    </w:p>
+    <w:p>
+      <w:pPr>
+        <w:numPr>
+          <w:ilvl w:val="0"/>
+          <w:numId w:val="1008"/>
+        </w:numPr>
+        <w:pStyle w:val="Compact"/>
+      </w:pPr>
+      <w:r>
         <w:t xml:space="preserve">Ordine: libreria → AA-17 → varianti → markup → contenuti → alt delle news. Collaudo:</w:t>
       </w:r>
       <w:r>
@@ -2649,7 +2877,7 @@
       <w:pPr>
         <w:numPr>
           <w:ilvl w:val="0"/>
-          <w:numId w:val="1009"/>
+          <w:numId w:val="1010"/>
         </w:numPr>
         <w:pStyle w:val="Compact"/>
       </w:pPr>
@@ -2667,7 +2895,7 @@
       <w:pPr>
         <w:numPr>
           <w:ilvl w:val="0"/>
-          <w:numId w:val="1009"/>
+          <w:numId w:val="1010"/>
         </w:numPr>
         <w:pStyle w:val="Compact"/>
       </w:pPr>
@@ -2691,7 +2919,7 @@
       <w:pPr>
         <w:numPr>
           <w:ilvl w:val="0"/>
-          <w:numId w:val="1009"/>
+          <w:numId w:val="1010"/>
         </w:numPr>
         <w:pStyle w:val="Compact"/>
       </w:pPr>
@@ -3023,6 +3251,9 @@
     <w:abstractNumId w:val="991"/>
   </w:num>
   <w:num w:numId="1009">
+    <w:abstractNumId w:val="991"/>
+  </w:num>
+  <w:num w:numId="1010">
     <w:abstractNumId w:val="99411"/>
     <w:lvlOverride w:ilvl="0">
       <w:startOverride w:val="1"/>

</xml_diff>